<commit_message>
fix(quiz-engine): root-cause repair of universal topic generation, validation, reasoning probes, and psychometrics
</commit_message>
<xml_diff>
--- a/Report/DeepLearnX_Comprehensive_Project_Report.docx
+++ b/Report/DeepLearnX_Comprehensive_Project_Report.docx
@@ -762,61 +762,6 @@
     <w:p>
       <w:r>
         <w:t>To process temporal response latencies, confidence dynamics, and tabular psychometric vectors simultaneously, we engineered DeepCognitiveNet in PyTorch. DeepCognitiveNet is a dual-branch neural architecture featuring recurrent sequential processing, self-attention bottleneck pooling, and dense tabular representation learning.</w:t>
-      </w:r>
-    </w:p>
-    <w:p>
-      <w:pPr>
-        <w:spacing w:after="40"/>
-      </w:pPr>
-    </w:p>
-    <w:p>
-      <w:r>
-        <w:drawing>
-          <wp:inline xmlns:a="http://schemas.openxmlformats.org/drawingml/2006/main" xmlns:pic="http://schemas.openxmlformats.org/drawingml/2006/picture">
-            <wp:extent cx="5943600" cy="4245429"/>
-            <wp:docPr id="1" name="Picture 1"/>
-            <wp:cNvGraphicFramePr>
-              <a:graphicFrameLocks noChangeAspect="1"/>
-            </wp:cNvGraphicFramePr>
-            <a:graphic>
-              <a:graphicData uri="http://schemas.openxmlformats.org/drawingml/2006/picture">
-                <pic:pic>
-                  <pic:nvPicPr>
-                    <pic:cNvPr id="0" name="architecture_diagram.png"/>
-                    <pic:cNvPicPr/>
-                  </pic:nvPicPr>
-                  <pic:blipFill>
-                    <a:blip r:embed="rId9"/>
-                    <a:stretch>
-                      <a:fillRect/>
-                    </a:stretch>
-                  </pic:blipFill>
-                  <pic:spPr>
-                    <a:xfrm>
-                      <a:off x="0" y="0"/>
-                      <a:ext cx="5943600" cy="4245429"/>
-                    </a:xfrm>
-                    <a:prstGeom prst="rect"/>
-                  </pic:spPr>
-                </pic:pic>
-              </a:graphicData>
-            </a:graphic>
-          </wp:inline>
-        </w:drawing>
-      </w:r>
-    </w:p>
-    <w:p>
-      <w:pPr>
-        <w:spacing w:before="80" w:after="200"/>
-        <w:jc w:val="center"/>
-      </w:pPr>
-      <w:r>
-        <w:rPr>
-          <w:i/>
-          <w:color w:val="475569"/>
-          <w:sz w:val="19"/>
-        </w:rPr>
-        <w:t>Figure 1: Complete DeepCognitiveNet Multi-Branch Neural Network Architecture.</w:t>
       </w:r>
     </w:p>
     <w:p>
@@ -2352,61 +2297,6 @@
     </w:p>
     <w:p>
       <w:pPr>
-        <w:spacing w:after="40"/>
-      </w:pPr>
-    </w:p>
-    <w:p>
-      <w:r>
-        <w:drawing>
-          <wp:inline xmlns:a="http://schemas.openxmlformats.org/drawingml/2006/main" xmlns:pic="http://schemas.openxmlformats.org/drawingml/2006/picture">
-            <wp:extent cx="5943600" cy="2476500"/>
-            <wp:docPr id="2" name="Picture 2"/>
-            <wp:cNvGraphicFramePr>
-              <a:graphicFrameLocks noChangeAspect="1"/>
-            </wp:cNvGraphicFramePr>
-            <a:graphic>
-              <a:graphicData uri="http://schemas.openxmlformats.org/drawingml/2006/picture">
-                <pic:pic>
-                  <pic:nvPicPr>
-                    <pic:cNvPr id="0" name="training_curves.png"/>
-                    <pic:cNvPicPr/>
-                  </pic:nvPicPr>
-                  <pic:blipFill>
-                    <a:blip r:embed="rId10"/>
-                    <a:stretch>
-                      <a:fillRect/>
-                    </a:stretch>
-                  </pic:blipFill>
-                  <pic:spPr>
-                    <a:xfrm>
-                      <a:off x="0" y="0"/>
-                      <a:ext cx="5943600" cy="2476500"/>
-                    </a:xfrm>
-                    <a:prstGeom prst="rect"/>
-                  </pic:spPr>
-                </pic:pic>
-              </a:graphicData>
-            </a:graphic>
-          </wp:inline>
-        </w:drawing>
-      </w:r>
-    </w:p>
-    <w:p>
-      <w:pPr>
-        <w:spacing w:before="80" w:after="200"/>
-        <w:jc w:val="center"/>
-      </w:pPr>
-      <w:r>
-        <w:rPr>
-          <w:i/>
-          <w:color w:val="475569"/>
-          <w:sz w:val="19"/>
-        </w:rPr>
-        <w:t>Figure 2: Multi-Task Loss Convergence and Validation Accuracy / Macro F1 across 25 Training Epochs.</w:t>
-      </w:r>
-    </w:p>
-    <w:p>
-      <w:pPr>
         <w:pStyle w:val="Heading2"/>
       </w:pPr>
       <w:r>
@@ -3431,61 +3321,6 @@
       <w:pPr>
         <w:spacing w:before="0" w:after="120"/>
       </w:pPr>
-    </w:p>
-    <w:p>
-      <w:pPr>
-        <w:spacing w:after="40"/>
-      </w:pPr>
-    </w:p>
-    <w:p>
-      <w:r>
-        <w:drawing>
-          <wp:inline xmlns:a="http://schemas.openxmlformats.org/drawingml/2006/main" xmlns:pic="http://schemas.openxmlformats.org/drawingml/2006/picture">
-            <wp:extent cx="4114800" cy="3526971"/>
-            <wp:docPr id="3" name="Picture 3"/>
-            <wp:cNvGraphicFramePr>
-              <a:graphicFrameLocks noChangeAspect="1"/>
-            </wp:cNvGraphicFramePr>
-            <a:graphic>
-              <a:graphicData uri="http://schemas.openxmlformats.org/drawingml/2006/picture">
-                <pic:pic>
-                  <pic:nvPicPr>
-                    <pic:cNvPr id="0" name="confusion_matrix.png"/>
-                    <pic:cNvPicPr/>
-                  </pic:nvPicPr>
-                  <pic:blipFill>
-                    <a:blip r:embed="rId11"/>
-                    <a:stretch>
-                      <a:fillRect/>
-                    </a:stretch>
-                  </pic:blipFill>
-                  <pic:spPr>
-                    <a:xfrm>
-                      <a:off x="0" y="0"/>
-                      <a:ext cx="4114800" cy="3526971"/>
-                    </a:xfrm>
-                    <a:prstGeom prst="rect"/>
-                  </pic:spPr>
-                </pic:pic>
-              </a:graphicData>
-            </a:graphic>
-          </wp:inline>
-        </w:drawing>
-      </w:r>
-    </w:p>
-    <w:p>
-      <w:pPr>
-        <w:spacing w:before="80" w:after="200"/>
-        <w:jc w:val="center"/>
-      </w:pPr>
-      <w:r>
-        <w:rPr>
-          <w:i/>
-          <w:color w:val="475569"/>
-          <w:sz w:val="19"/>
-        </w:rPr>
-        <w:t>Figure 3: Test Confusion Matrix showcasing 100% precision and recall across all cognitive archetypes.</w:t>
-      </w:r>
     </w:p>
     <w:p>
       <w:pPr>

</xml_diff>